<commit_message>
docs: finalize and polish complete Word document report in docs
</commit_message>
<xml_diff>
--- a/docs/HandRehab_AI_Project_Report.docx
+++ b/docs/HandRehab_AI_Project_Report.docx
@@ -126,12 +126,7 @@
           <w:rFonts w:ascii="Times New Roman" w:hAnsi="Times New Roman" w:cs="Times New Roman"/>
         </w:rPr>
       </w:pPr>
-      <w:r>
-        <w:rPr>
-          <w:rFonts w:ascii="Times New Roman" w:hAnsi="Times New Roman" w:cs="Times New Roman"/>
-        </w:rPr>
-        <w:t>&lt;Font Size 14&gt;&lt;Italic&gt;</w:t>
-      </w:r>
+      <w:r/>
     </w:p>
     <w:p>
       <w:pPr>
@@ -174,12 +169,7 @@
           <w:rFonts w:ascii="Times New Roman" w:hAnsi="Times New Roman" w:cs="Times New Roman"/>
         </w:rPr>
       </w:pPr>
-      <w:r>
-        <w:rPr>
-          <w:rFonts w:ascii="Times New Roman" w:hAnsi="Times New Roman" w:cs="Times New Roman"/>
-        </w:rPr>
-        <w:t>&lt;Font Size 16&gt;</w:t>
-      </w:r>
+      <w:r/>
     </w:p>
     <w:p>
       <w:pPr>
@@ -279,26 +269,7 @@
           <w:rFonts w:ascii="Times New Roman" w:hAnsi="Times New Roman" w:cs="Times New Roman"/>
         </w:rPr>
       </w:pPr>
-      <w:r>
-        <w:rPr>
-          <w:rFonts w:ascii="Times New Roman" w:hAnsi="Times New Roman" w:cs="Times New Roman"/>
-        </w:rPr>
-        <w:t>&lt;Font Size 14&gt;&lt;</w:t>
-      </w:r>
-      <w:proofErr w:type="gramStart"/>
-      <w:r>
-        <w:rPr>
-          <w:rFonts w:ascii="Times New Roman" w:hAnsi="Times New Roman" w:cs="Times New Roman"/>
-        </w:rPr>
-        <w:t>1.5 line</w:t>
-      </w:r>
-      <w:proofErr w:type="gramEnd"/>
-      <w:r>
-        <w:rPr>
-          <w:rFonts w:ascii="Times New Roman" w:hAnsi="Times New Roman" w:cs="Times New Roman"/>
-        </w:rPr>
-        <w:t xml:space="preserve"> spacing&gt;&lt;Italic&gt;</w:t>
-      </w:r>
+      <w:r/>
     </w:p>
     <w:p>
       <w:pPr>
@@ -342,12 +313,7 @@
           <w:rFonts w:ascii="Times New Roman" w:hAnsi="Times New Roman" w:cs="Times New Roman"/>
         </w:rPr>
       </w:pPr>
-      <w:r>
-        <w:rPr>
-          <w:rFonts w:ascii="Times New Roman" w:hAnsi="Times New Roman" w:cs="Times New Roman"/>
-        </w:rPr>
-        <w:t>&lt;Font Size 16&gt;</w:t>
-      </w:r>
+      <w:r/>
     </w:p>
     <w:p>
       <w:pPr>
@@ -431,12 +397,7 @@
           <w:rFonts w:ascii="Times New Roman" w:hAnsi="Times New Roman" w:cs="Times New Roman"/>
         </w:rPr>
       </w:pPr>
-      <w:r>
-        <w:rPr>
-          <w:rFonts w:ascii="Times New Roman" w:hAnsi="Times New Roman" w:cs="Times New Roman"/>
-        </w:rPr>
-        <w:t>&lt;Font Size 14&gt;</w:t>
-      </w:r>
+      <w:r/>
     </w:p>
     <w:p>
       <w:pPr>
@@ -495,12 +456,7 @@
           <w:rFonts w:ascii="Times New Roman" w:hAnsi="Times New Roman" w:cs="Times New Roman"/>
         </w:rPr>
       </w:pPr>
-      <w:r>
-        <w:rPr>
-          <w:rFonts w:ascii="Times New Roman" w:hAnsi="Times New Roman" w:cs="Times New Roman"/>
-        </w:rPr>
-        <w:t>&lt;Font Size 14&gt;</w:t>
-      </w:r>
+      <w:r/>
     </w:p>
     <w:p>
       <w:pPr>
@@ -553,20 +509,7 @@
           <w:rFonts w:ascii="Times New Roman" w:hAnsi="Times New Roman" w:cs="Times New Roman"/>
         </w:rPr>
       </w:pPr>
-      <w:r>
-        <w:rPr>
-          <w:rFonts w:ascii="Times New Roman" w:hAnsi="Times New Roman" w:cs="Times New Roman"/>
-          <w:sz w:val="28"/>
-          <w:szCs w:val="28"/>
-        </w:rPr>
-        <w:t>&lt;</w:t>
-      </w:r>
-      <w:r>
-        <w:rPr>
-          <w:rFonts w:ascii="Times New Roman" w:hAnsi="Times New Roman" w:cs="Times New Roman"/>
-        </w:rPr>
-        <w:t>Font Size 14&gt;</w:t>
-      </w:r>
+      <w:r/>
     </w:p>
     <w:p>
       <w:pPr>
@@ -750,102 +693,7 @@
         </w:rPr>
       </w:pPr>
       <w:r>
-        <w:rPr>
-          <w:rFonts w:ascii="Times New Roman" w:hAnsi="Times New Roman" w:cs="Times New Roman"/>
-        </w:rPr>
-        <w:t xml:space="preserve">Certificate that this project </w:t>
-      </w:r>
-      <w:proofErr w:type="gramStart"/>
-      <w:r>
-        <w:rPr>
-          <w:rFonts w:ascii="Times New Roman" w:hAnsi="Times New Roman" w:cs="Times New Roman"/>
-        </w:rPr>
-        <w:t>report  “</w:t>
-      </w:r>
-      <w:proofErr w:type="gramEnd"/>
-      <w:r>
-        <w:rPr>
-          <w:rFonts w:ascii="Times New Roman" w:hAnsi="Times New Roman" w:cs="Times New Roman"/>
-        </w:rPr>
-        <w:t>……………………………</w:t>
-      </w:r>
-      <w:proofErr w:type="gramStart"/>
-      <w:r>
-        <w:rPr>
-          <w:rFonts w:ascii="Times New Roman" w:hAnsi="Times New Roman" w:cs="Times New Roman"/>
-        </w:rPr>
-        <w:t>…..</w:t>
-      </w:r>
-      <w:proofErr w:type="gramEnd"/>
-      <w:r>
-        <w:rPr>
-          <w:rFonts w:ascii="Times New Roman" w:hAnsi="Times New Roman" w:cs="Times New Roman"/>
-        </w:rPr>
-        <w:t xml:space="preserve">” is the </w:t>
-      </w:r>
-      <w:proofErr w:type="spellStart"/>
-      <w:r>
-        <w:rPr>
-          <w:rFonts w:ascii="Times New Roman" w:hAnsi="Times New Roman" w:cs="Times New Roman"/>
-        </w:rPr>
-        <w:t>bonafide</w:t>
-      </w:r>
-      <w:proofErr w:type="spellEnd"/>
-      <w:r>
-        <w:rPr>
-          <w:rFonts w:ascii="Times New Roman" w:hAnsi="Times New Roman" w:cs="Times New Roman"/>
-        </w:rPr>
-        <w:t xml:space="preserve"> work of “………………………. </w:t>
-      </w:r>
-      <w:proofErr w:type="gramStart"/>
-      <w:r>
-        <w:rPr>
-          <w:rFonts w:ascii="Times New Roman" w:hAnsi="Times New Roman" w:cs="Times New Roman"/>
-        </w:rPr>
-        <w:t>“ who</w:t>
-      </w:r>
-      <w:proofErr w:type="gramEnd"/>
-      <w:r>
-        <w:rPr>
-          <w:rFonts w:ascii="Times New Roman" w:hAnsi="Times New Roman" w:cs="Times New Roman"/>
-        </w:rPr>
-        <w:t xml:space="preserve"> carried out the project work under my supervision in ADA23DLU0</w:t>
-      </w:r>
-      <w:r>
-        <w:rPr>
-          <w:rFonts w:ascii="Times New Roman" w:hAnsi="Times New Roman" w:cs="Times New Roman"/>
-        </w:rPr>
-        <w:t>4</w:t>
-      </w:r>
-      <w:r>
-        <w:rPr>
-          <w:rFonts w:ascii="Times New Roman" w:hAnsi="Times New Roman" w:cs="Times New Roman"/>
-        </w:rPr>
-        <w:t xml:space="preserve"> </w:t>
-      </w:r>
-      <w:r>
-        <w:rPr>
-          <w:rFonts w:ascii="Times New Roman" w:hAnsi="Times New Roman" w:cs="Times New Roman"/>
-        </w:rPr>
-        <w:t>–</w:t>
-      </w:r>
-      <w:r>
-        <w:rPr>
-          <w:rFonts w:ascii="Times New Roman" w:hAnsi="Times New Roman" w:cs="Times New Roman"/>
-        </w:rPr>
-        <w:t xml:space="preserve"> </w:t>
-      </w:r>
-      <w:r>
-        <w:rPr>
-          <w:rFonts w:ascii="Times New Roman" w:hAnsi="Times New Roman" w:cs="Times New Roman"/>
-        </w:rPr>
-        <w:t>Natural Language Processing</w:t>
-      </w:r>
-      <w:r>
-        <w:rPr>
-          <w:rFonts w:ascii="Times New Roman" w:hAnsi="Times New Roman" w:cs="Times New Roman"/>
-        </w:rPr>
-        <w:t xml:space="preserve"> Laboratory.</w:t>
+        <w:t>Certified that this project report "HandRehab-AI: Monitoring Hand Recovery Using Patient Diaries and Computer Vision" is the bonafide work of the candidate(s) who carried out the project work under my supervision in ADA23DLU04 – Natural Language Processing Laboratory.</w:t>
       </w:r>
     </w:p>
     <w:p>
@@ -1224,30 +1072,13 @@
         </w:rPr>
       </w:pPr>
       <w:r>
-        <w:rPr>
-          <w:rFonts w:ascii="Times New Roman" w:hAnsi="Times New Roman" w:cs="Times New Roman"/>
-          <w:b/>
-          <w:bCs/>
-        </w:rPr>
-        <w:t xml:space="preserve">(Acknowledge Dean, Vice-Dean, </w:t>
-      </w:r>
-      <w:proofErr w:type="spellStart"/>
-      <w:r>
-        <w:rPr>
-          <w:rFonts w:ascii="Times New Roman" w:hAnsi="Times New Roman" w:cs="Times New Roman"/>
-          <w:b/>
-          <w:bCs/>
-        </w:rPr>
-        <w:t>HoD</w:t>
-      </w:r>
-      <w:proofErr w:type="spellEnd"/>
-      <w:r>
-        <w:rPr>
-          <w:rFonts w:ascii="Times New Roman" w:hAnsi="Times New Roman" w:cs="Times New Roman"/>
-          <w:b/>
-          <w:bCs/>
-        </w:rPr>
-        <w:t>, Course Faculty)</w:t>
+        <w:t>We express our sincere gratitude to our respected Dean, Vice-Dean, and Head of the Department of Computer Science and Engineering (Artificial Intelligence and Data Analytics) at Sri Ramachandra Faculty of Engineering and Technology for providing the research infrastructure and academic environment to pursue this work.</w:t>
+        <w:br/>
+        <w:br/>
+        <w:t>We extend our heartfelt gratitude to our project supervisor and course faculty, Dr. Suja Golden Shiny S., Assistant Professor, Department of Computer Science and Engineering (AIDA), for her invaluable guidance, constant encouragement, constructive suggestions, and continuous support throughout the development and evaluation of this project in the Natural Language Processing Laboratory.</w:t>
+        <w:br/>
+        <w:br/>
+        <w:t>We also thank the faculty members, technical staff, and our peers for their helpful feedback and assistance.</w:t>
       </w:r>
     </w:p>
     <w:p>
@@ -1628,6 +1459,7 @@
                 <w:rFonts w:ascii="Times New Roman" w:hAnsi="Times New Roman" w:cs="Times New Roman"/>
                 <w:b/>
                 <w:bCs/>
+                <w:sz w:val="20"/>
               </w:rPr>
               <w:t>CHAPTER NO.</w:t>
             </w:r>
@@ -1654,6 +1486,7 @@
                 <w:rFonts w:ascii="Times New Roman" w:hAnsi="Times New Roman" w:cs="Times New Roman"/>
                 <w:b/>
                 <w:bCs/>
+                <w:sz w:val="20"/>
               </w:rPr>
               <w:t>TITLE</w:t>
             </w:r>
@@ -1679,6 +1512,7 @@
                 <w:rFonts w:ascii="Times New Roman" w:hAnsi="Times New Roman" w:cs="Times New Roman"/>
                 <w:b/>
                 <w:bCs/>
+                <w:sz w:val="20"/>
               </w:rPr>
               <w:t>PAGE NO.</w:t>
             </w:r>
@@ -1727,6 +1561,7 @@
                 <w:rFonts w:ascii="Times New Roman" w:hAnsi="Times New Roman" w:cs="Times New Roman"/>
                 <w:b/>
                 <w:bCs/>
+                <w:sz w:val="20"/>
               </w:rPr>
               <w:t>ABSTRACT</w:t>
             </w:r>
@@ -1752,6 +1587,7 @@
                 <w:rFonts w:ascii="Times New Roman" w:hAnsi="Times New Roman" w:cs="Times New Roman"/>
                 <w:b/>
                 <w:bCs/>
+                <w:sz w:val="20"/>
               </w:rPr>
               <w:t>v</w:t>
             </w:r>
@@ -1800,6 +1636,7 @@
                 <w:rFonts w:ascii="Times New Roman" w:hAnsi="Times New Roman" w:cs="Times New Roman"/>
                 <w:b/>
                 <w:bCs/>
+                <w:sz w:val="20"/>
               </w:rPr>
               <w:t xml:space="preserve">LIST OF </w:t>
             </w:r>
@@ -1809,6 +1646,7 @@
                 <w:rFonts w:ascii="Times New Roman" w:hAnsi="Times New Roman" w:cs="Times New Roman"/>
                 <w:b/>
                 <w:bCs/>
+                <w:sz w:val="20"/>
               </w:rPr>
               <w:t>TABLE</w:t>
             </w:r>
@@ -1835,6 +1673,7 @@
                 <w:rFonts w:ascii="Times New Roman" w:hAnsi="Times New Roman" w:cs="Times New Roman"/>
                 <w:b/>
                 <w:bCs/>
+                <w:sz w:val="20"/>
               </w:rPr>
               <w:t>v</w:t>
             </w:r>
@@ -1843,6 +1682,7 @@
                 <w:rFonts w:ascii="Times New Roman" w:hAnsi="Times New Roman" w:cs="Times New Roman"/>
                 <w:b/>
                 <w:bCs/>
+                <w:sz w:val="20"/>
               </w:rPr>
               <w:t>i</w:t>
             </w:r>
@@ -1891,6 +1731,7 @@
                 <w:rFonts w:ascii="Times New Roman" w:hAnsi="Times New Roman" w:cs="Times New Roman"/>
                 <w:b/>
                 <w:bCs/>
+                <w:sz w:val="20"/>
               </w:rPr>
               <w:t>LIST OF FIGURES</w:t>
             </w:r>
@@ -1916,6 +1757,7 @@
                 <w:rFonts w:ascii="Times New Roman" w:hAnsi="Times New Roman" w:cs="Times New Roman"/>
                 <w:b/>
                 <w:bCs/>
+                <w:sz w:val="20"/>
               </w:rPr>
               <w:t>vi</w:t>
             </w:r>
@@ -1924,6 +1766,7 @@
                 <w:rFonts w:ascii="Times New Roman" w:hAnsi="Times New Roman" w:cs="Times New Roman"/>
                 <w:b/>
                 <w:bCs/>
+                <w:sz w:val="20"/>
               </w:rPr>
               <w:t>i</w:t>
             </w:r>
@@ -1972,6 +1815,7 @@
                 <w:rFonts w:ascii="Times New Roman" w:hAnsi="Times New Roman" w:cs="Times New Roman"/>
                 <w:b/>
                 <w:bCs/>
+                <w:sz w:val="20"/>
               </w:rPr>
               <w:t>LIST OF SYMBOLS</w:t>
             </w:r>
@@ -1997,6 +1841,7 @@
                 <w:rFonts w:ascii="Times New Roman" w:hAnsi="Times New Roman" w:cs="Times New Roman"/>
                 <w:b/>
                 <w:bCs/>
+                <w:sz w:val="20"/>
               </w:rPr>
               <w:t>vii</w:t>
             </w:r>
@@ -2005,6 +1850,7 @@
                 <w:rFonts w:ascii="Times New Roman" w:hAnsi="Times New Roman" w:cs="Times New Roman"/>
                 <w:b/>
                 <w:bCs/>
+                <w:sz w:val="20"/>
               </w:rPr>
               <w:t>i</w:t>
             </w:r>
@@ -2035,6 +1881,7 @@
                 <w:rFonts w:ascii="Times New Roman" w:hAnsi="Times New Roman" w:cs="Times New Roman"/>
                 <w:b/>
                 <w:bCs/>
+                <w:sz w:val="20"/>
               </w:rPr>
               <w:t>1.</w:t>
             </w:r>
@@ -2061,6 +1908,7 @@
                 <w:rFonts w:ascii="Times New Roman" w:hAnsi="Times New Roman" w:cs="Times New Roman"/>
                 <w:b/>
                 <w:bCs/>
+                <w:sz w:val="20"/>
               </w:rPr>
               <w:t>INTRODUCTION</w:t>
             </w:r>
@@ -2082,6 +1930,7 @@
             <w:r>
               <w:rPr>
                 <w:rFonts w:ascii="Times New Roman" w:hAnsi="Times New Roman" w:cs="Times New Roman"/>
+                <w:sz w:val="20"/>
               </w:rPr>
               <w:t>1</w:t>
             </w:r>
@@ -2125,6 +1974,7 @@
             <w:r>
               <w:rPr>
                 <w:rFonts w:ascii="Times New Roman" w:hAnsi="Times New Roman" w:cs="Times New Roman"/>
+                <w:sz w:val="20"/>
               </w:rPr>
               <w:t>1.1</w:t>
             </w:r>
@@ -2147,6 +1997,7 @@
             <w:r>
               <w:rPr>
                 <w:rFonts w:ascii="Times New Roman" w:hAnsi="Times New Roman" w:cs="Times New Roman"/>
+                <w:sz w:val="20"/>
               </w:rPr>
               <w:t>Project overview</w:t>
             </w:r>
@@ -2168,6 +2019,7 @@
             <w:r>
               <w:rPr>
                 <w:rFonts w:ascii="Times New Roman" w:hAnsi="Times New Roman" w:cs="Times New Roman"/>
+                <w:sz w:val="20"/>
               </w:rPr>
               <w:t>2</w:t>
             </w:r>
@@ -2211,6 +2063,7 @@
             <w:r>
               <w:rPr>
                 <w:rFonts w:ascii="Times New Roman" w:hAnsi="Times New Roman" w:cs="Times New Roman"/>
+                <w:sz w:val="20"/>
               </w:rPr>
               <w:t>1.2</w:t>
             </w:r>
@@ -2233,6 +2086,7 @@
             <w:r>
               <w:rPr>
                 <w:rFonts w:ascii="Times New Roman" w:hAnsi="Times New Roman" w:cs="Times New Roman"/>
+                <w:sz w:val="20"/>
               </w:rPr>
               <w:t>Problem Statement</w:t>
             </w:r>
@@ -2254,6 +2108,7 @@
             <w:r>
               <w:rPr>
                 <w:rFonts w:ascii="Times New Roman" w:hAnsi="Times New Roman" w:cs="Times New Roman"/>
+                <w:sz w:val="20"/>
               </w:rPr>
               <w:t>4</w:t>
             </w:r>
@@ -2297,6 +2152,7 @@
             <w:r>
               <w:rPr>
                 <w:rFonts w:ascii="Times New Roman" w:hAnsi="Times New Roman" w:cs="Times New Roman"/>
+                <w:sz w:val="20"/>
               </w:rPr>
               <w:t>1.3</w:t>
             </w:r>
@@ -2319,6 +2175,7 @@
             <w:r>
               <w:rPr>
                 <w:rFonts w:ascii="Times New Roman" w:hAnsi="Times New Roman" w:cs="Times New Roman"/>
+                <w:sz w:val="20"/>
               </w:rPr>
               <w:t>Objectives</w:t>
             </w:r>
@@ -2340,6 +2197,7 @@
             <w:r>
               <w:rPr>
                 <w:rFonts w:ascii="Times New Roman" w:hAnsi="Times New Roman" w:cs="Times New Roman"/>
+                <w:sz w:val="20"/>
               </w:rPr>
               <w:t>4</w:t>
             </w:r>
@@ -2383,6 +2241,7 @@
             <w:r>
               <w:rPr>
                 <w:rFonts w:ascii="Times New Roman" w:hAnsi="Times New Roman" w:cs="Times New Roman"/>
+                <w:sz w:val="20"/>
               </w:rPr>
               <w:t>1.4</w:t>
             </w:r>
@@ -2405,12 +2264,14 @@
             <w:r>
               <w:rPr>
                 <w:rFonts w:ascii="Times New Roman" w:hAnsi="Times New Roman" w:cs="Times New Roman"/>
+                <w:sz w:val="20"/>
               </w:rPr>
               <w:t>Scope of Work</w:t>
             </w:r>
             <w:r>
               <w:rPr>
                 <w:rFonts w:ascii="Times New Roman" w:hAnsi="Times New Roman" w:cs="Times New Roman"/>
+                <w:sz w:val="20"/>
               </w:rPr>
               <w:t xml:space="preserve"> (or) Social Contribution</w:t>
             </w:r>
@@ -2432,6 +2293,7 @@
             <w:r>
               <w:rPr>
                 <w:rFonts w:ascii="Times New Roman" w:hAnsi="Times New Roman" w:cs="Times New Roman"/>
+                <w:sz w:val="20"/>
               </w:rPr>
               <w:t>5</w:t>
             </w:r>
@@ -2462,6 +2324,7 @@
                 <w:rFonts w:ascii="Times New Roman" w:hAnsi="Times New Roman" w:cs="Times New Roman"/>
                 <w:b/>
                 <w:bCs/>
+                <w:sz w:val="20"/>
               </w:rPr>
               <w:t>2.</w:t>
             </w:r>
@@ -2488,6 +2351,7 @@
                 <w:rFonts w:ascii="Times New Roman" w:hAnsi="Times New Roman" w:cs="Times New Roman"/>
                 <w:b/>
                 <w:bCs/>
+                <w:sz w:val="20"/>
               </w:rPr>
               <w:t>LITERATURE REVIEW</w:t>
             </w:r>
@@ -2509,6 +2373,7 @@
             <w:r>
               <w:rPr>
                 <w:rFonts w:ascii="Times New Roman" w:hAnsi="Times New Roman" w:cs="Times New Roman"/>
+                <w:sz w:val="20"/>
               </w:rPr>
               <w:t>6</w:t>
             </w:r>
@@ -2552,6 +2417,7 @@
             <w:r>
               <w:rPr>
                 <w:rFonts w:ascii="Times New Roman" w:hAnsi="Times New Roman" w:cs="Times New Roman"/>
+                <w:sz w:val="20"/>
               </w:rPr>
               <w:t>2.1</w:t>
             </w:r>
@@ -2574,6 +2440,7 @@
             <w:r>
               <w:rPr>
                 <w:rFonts w:ascii="Times New Roman" w:hAnsi="Times New Roman" w:cs="Times New Roman"/>
+                <w:sz w:val="20"/>
               </w:rPr>
               <w:t>Background</w:t>
             </w:r>
@@ -2595,6 +2462,7 @@
             <w:r>
               <w:rPr>
                 <w:rFonts w:ascii="Times New Roman" w:hAnsi="Times New Roman" w:cs="Times New Roman"/>
+                <w:sz w:val="20"/>
               </w:rPr>
               <w:t>6</w:t>
             </w:r>
@@ -2642,19 +2510,12 @@
             <w:tcW w:w="709" w:type="dxa"/>
           </w:tcPr>
           <w:p>
-            <w:pPr>
-              <w:pStyle w:val="NoSpacing"/>
-              <w:spacing w:line="480" w:lineRule="auto"/>
-              <w:jc w:val="left"/>
-              <w:rPr>
-                <w:rFonts w:ascii="Times New Roman" w:hAnsi="Times New Roman" w:cs="Times New Roman"/>
-              </w:rPr>
-            </w:pPr>
             <w:r>
               <w:rPr>
-                <w:rFonts w:ascii="Times New Roman" w:hAnsi="Times New Roman" w:cs="Times New Roman"/>
-              </w:rPr>
-              <w:t>2.2.1</w:t>
+                <w:rFonts w:ascii="Times New Roman" w:hAnsi="Times New Roman"/>
+                <w:sz w:val="20"/>
+              </w:rPr>
+              <w:t>2.1.1</w:t>
             </w:r>
           </w:p>
         </w:tc>
@@ -2663,19 +2524,12 @@
             <w:tcW w:w="3402" w:type="dxa"/>
           </w:tcPr>
           <w:p>
-            <w:pPr>
-              <w:pStyle w:val="NoSpacing"/>
-              <w:spacing w:line="480" w:lineRule="auto"/>
-              <w:jc w:val="left"/>
-              <w:rPr>
-                <w:rFonts w:ascii="Times New Roman" w:hAnsi="Times New Roman" w:cs="Times New Roman"/>
-              </w:rPr>
-            </w:pPr>
             <w:r>
               <w:rPr>
-                <w:rFonts w:ascii="Times New Roman" w:hAnsi="Times New Roman" w:cs="Times New Roman"/>
-              </w:rPr>
-              <w:t>Review of related work</w:t>
+                <w:rFonts w:ascii="Times New Roman" w:hAnsi="Times New Roman"/>
+                <w:sz w:val="20"/>
+              </w:rPr>
+              <w:t>Review of related works</w:t>
             </w:r>
           </w:p>
         </w:tc>
@@ -2695,6 +2549,7 @@
             <w:r>
               <w:rPr>
                 <w:rFonts w:ascii="Times New Roman" w:hAnsi="Times New Roman" w:cs="Times New Roman"/>
+                <w:sz w:val="20"/>
               </w:rPr>
               <w:t>7</w:t>
             </w:r>
@@ -2738,6 +2593,7 @@
             <w:r>
               <w:rPr>
                 <w:rFonts w:ascii="Times New Roman" w:hAnsi="Times New Roman" w:cs="Times New Roman"/>
+                <w:sz w:val="20"/>
               </w:rPr>
               <w:t>2.2</w:t>
             </w:r>
@@ -2760,6 +2616,7 @@
             <w:r>
               <w:rPr>
                 <w:rFonts w:ascii="Times New Roman" w:hAnsi="Times New Roman" w:cs="Times New Roman"/>
+                <w:sz w:val="20"/>
               </w:rPr>
               <w:t>Research Gaps</w:t>
             </w:r>
@@ -2781,6 +2638,7 @@
             <w:r>
               <w:rPr>
                 <w:rFonts w:ascii="Times New Roman" w:hAnsi="Times New Roman" w:cs="Times New Roman"/>
+                <w:sz w:val="20"/>
               </w:rPr>
               <w:t>8</w:t>
             </w:r>
@@ -2811,6 +2669,7 @@
                 <w:rFonts w:ascii="Times New Roman" w:hAnsi="Times New Roman" w:cs="Times New Roman"/>
                 <w:b/>
                 <w:bCs/>
+                <w:sz w:val="20"/>
               </w:rPr>
               <w:t>3.</w:t>
             </w:r>
@@ -2837,6 +2696,7 @@
                 <w:rFonts w:ascii="Times New Roman" w:hAnsi="Times New Roman" w:cs="Times New Roman"/>
                 <w:b/>
                 <w:bCs/>
+                <w:sz w:val="20"/>
               </w:rPr>
               <w:t>PROPOSED METHODOLOGY</w:t>
             </w:r>
@@ -2858,6 +2718,7 @@
             <w:r>
               <w:rPr>
                 <w:rFonts w:ascii="Times New Roman" w:hAnsi="Times New Roman" w:cs="Times New Roman"/>
+                <w:sz w:val="20"/>
               </w:rPr>
               <w:t>9</w:t>
             </w:r>
@@ -2901,6 +2762,7 @@
             <w:r>
               <w:rPr>
                 <w:rFonts w:ascii="Times New Roman" w:hAnsi="Times New Roman" w:cs="Times New Roman"/>
+                <w:sz w:val="20"/>
               </w:rPr>
               <w:t>3.1</w:t>
             </w:r>
@@ -2923,6 +2785,7 @@
             <w:r>
               <w:rPr>
                 <w:rFonts w:ascii="Times New Roman" w:hAnsi="Times New Roman" w:cs="Times New Roman"/>
+                <w:sz w:val="20"/>
               </w:rPr>
               <w:t>Architecture in Nutshell</w:t>
             </w:r>
@@ -2944,6 +2807,7 @@
             <w:r>
               <w:rPr>
                 <w:rFonts w:ascii="Times New Roman" w:hAnsi="Times New Roman" w:cs="Times New Roman"/>
+                <w:sz w:val="20"/>
               </w:rPr>
               <w:t>9</w:t>
             </w:r>
@@ -2991,17 +2855,10 @@
             <w:tcW w:w="709" w:type="dxa"/>
           </w:tcPr>
           <w:p>
-            <w:pPr>
-              <w:pStyle w:val="NoSpacing"/>
-              <w:spacing w:line="480" w:lineRule="auto"/>
-              <w:jc w:val="left"/>
-              <w:rPr>
-                <w:rFonts w:ascii="Times New Roman" w:hAnsi="Times New Roman" w:cs="Times New Roman"/>
-              </w:rPr>
-            </w:pPr>
             <w:r>
               <w:rPr>
-                <w:rFonts w:ascii="Times New Roman" w:hAnsi="Times New Roman" w:cs="Times New Roman"/>
+                <w:rFonts w:ascii="Times New Roman" w:hAnsi="Times New Roman"/>
+                <w:sz w:val="20"/>
               </w:rPr>
               <w:t>3.1.1</w:t>
             </w:r>
@@ -3012,19 +2869,12 @@
             <w:tcW w:w="3402" w:type="dxa"/>
           </w:tcPr>
           <w:p>
-            <w:pPr>
-              <w:pStyle w:val="NoSpacing"/>
-              <w:spacing w:line="480" w:lineRule="auto"/>
-              <w:jc w:val="left"/>
-              <w:rPr>
-                <w:rFonts w:ascii="Times New Roman" w:hAnsi="Times New Roman" w:cs="Times New Roman"/>
-              </w:rPr>
-            </w:pPr>
             <w:r>
               <w:rPr>
-                <w:rFonts w:ascii="Times New Roman" w:hAnsi="Times New Roman" w:cs="Times New Roman"/>
-              </w:rPr>
-              <w:t>………</w:t>
+                <w:rFonts w:ascii="Times New Roman" w:hAnsi="Times New Roman"/>
+                <w:sz w:val="20"/>
+              </w:rPr>
+              <w:t>Dataset Description and Exploratory Analysis</w:t>
             </w:r>
           </w:p>
         </w:tc>
@@ -3044,6 +2894,7 @@
             <w:r>
               <w:rPr>
                 <w:rFonts w:ascii="Times New Roman" w:hAnsi="Times New Roman" w:cs="Times New Roman"/>
+                <w:sz w:val="20"/>
               </w:rPr>
               <w:t>12</w:t>
             </w:r>
@@ -3091,17 +2942,10 @@
             <w:tcW w:w="709" w:type="dxa"/>
           </w:tcPr>
           <w:p>
-            <w:pPr>
-              <w:pStyle w:val="NoSpacing"/>
-              <w:spacing w:line="480" w:lineRule="auto"/>
-              <w:jc w:val="left"/>
-              <w:rPr>
-                <w:rFonts w:ascii="Times New Roman" w:hAnsi="Times New Roman" w:cs="Times New Roman"/>
-              </w:rPr>
-            </w:pPr>
             <w:r>
               <w:rPr>
-                <w:rFonts w:ascii="Times New Roman" w:hAnsi="Times New Roman" w:cs="Times New Roman"/>
+                <w:rFonts w:ascii="Times New Roman" w:hAnsi="Times New Roman"/>
+                <w:sz w:val="20"/>
               </w:rPr>
               <w:t>3.1.2</w:t>
             </w:r>
@@ -3112,19 +2956,12 @@
             <w:tcW w:w="3402" w:type="dxa"/>
           </w:tcPr>
           <w:p>
-            <w:pPr>
-              <w:pStyle w:val="NoSpacing"/>
-              <w:spacing w:line="480" w:lineRule="auto"/>
-              <w:jc w:val="left"/>
-              <w:rPr>
-                <w:rFonts w:ascii="Times New Roman" w:hAnsi="Times New Roman" w:cs="Times New Roman"/>
-              </w:rPr>
-            </w:pPr>
             <w:r>
               <w:rPr>
-                <w:rFonts w:ascii="Times New Roman" w:hAnsi="Times New Roman" w:cs="Times New Roman"/>
-              </w:rPr>
-              <w:t>……….</w:t>
+                <w:rFonts w:ascii="Times New Roman" w:hAnsi="Times New Roman"/>
+                <w:sz w:val="20"/>
+              </w:rPr>
+              <w:t>Negation-Preserving Preprocessing Pipeline</w:t>
             </w:r>
           </w:p>
         </w:tc>
@@ -3144,6 +2981,7 @@
             <w:r>
               <w:rPr>
                 <w:rFonts w:ascii="Times New Roman" w:hAnsi="Times New Roman" w:cs="Times New Roman"/>
+                <w:sz w:val="20"/>
               </w:rPr>
               <w:t>16</w:t>
             </w:r>
@@ -3187,6 +3025,7 @@
             <w:r>
               <w:rPr>
                 <w:rFonts w:ascii="Times New Roman" w:hAnsi="Times New Roman" w:cs="Times New Roman"/>
+                <w:sz w:val="20"/>
               </w:rPr>
               <w:t xml:space="preserve">3.2 </w:t>
             </w:r>
@@ -3209,6 +3048,7 @@
             <w:r>
               <w:rPr>
                 <w:rFonts w:ascii="Times New Roman" w:hAnsi="Times New Roman" w:cs="Times New Roman"/>
+                <w:sz w:val="20"/>
               </w:rPr>
               <w:t>Hardware Specifications</w:t>
             </w:r>
@@ -3230,6 +3070,7 @@
             <w:r>
               <w:rPr>
                 <w:rFonts w:ascii="Times New Roman" w:hAnsi="Times New Roman" w:cs="Times New Roman"/>
+                <w:sz w:val="20"/>
               </w:rPr>
               <w:t>18</w:t>
             </w:r>
@@ -3273,6 +3114,7 @@
             <w:r>
               <w:rPr>
                 <w:rFonts w:ascii="Times New Roman" w:hAnsi="Times New Roman" w:cs="Times New Roman"/>
+                <w:sz w:val="20"/>
               </w:rPr>
               <w:t>3.3</w:t>
             </w:r>
@@ -3295,6 +3137,7 @@
             <w:r>
               <w:rPr>
                 <w:rFonts w:ascii="Times New Roman" w:hAnsi="Times New Roman" w:cs="Times New Roman"/>
+                <w:sz w:val="20"/>
               </w:rPr>
               <w:t>Software Specifications</w:t>
             </w:r>
@@ -3316,6 +3159,7 @@
             <w:r>
               <w:rPr>
                 <w:rFonts w:ascii="Times New Roman" w:hAnsi="Times New Roman" w:cs="Times New Roman"/>
+                <w:sz w:val="20"/>
               </w:rPr>
               <w:t>20</w:t>
             </w:r>
@@ -3346,6 +3190,7 @@
                 <w:rFonts w:ascii="Times New Roman" w:hAnsi="Times New Roman" w:cs="Times New Roman"/>
                 <w:b/>
                 <w:bCs/>
+                <w:sz w:val="20"/>
               </w:rPr>
               <w:t>4.</w:t>
             </w:r>
@@ -3372,6 +3217,7 @@
                 <w:rFonts w:ascii="Times New Roman" w:hAnsi="Times New Roman" w:cs="Times New Roman"/>
                 <w:b/>
                 <w:bCs/>
+                <w:sz w:val="20"/>
               </w:rPr>
               <w:t>PERFORMANCE EVALUATION</w:t>
             </w:r>
@@ -3393,6 +3239,7 @@
             <w:r>
               <w:rPr>
                 <w:rFonts w:ascii="Times New Roman" w:hAnsi="Times New Roman" w:cs="Times New Roman"/>
+                <w:sz w:val="20"/>
               </w:rPr>
               <w:t>21</w:t>
             </w:r>
@@ -3436,6 +3283,7 @@
             <w:r>
               <w:rPr>
                 <w:rFonts w:ascii="Times New Roman" w:hAnsi="Times New Roman" w:cs="Times New Roman"/>
+                <w:sz w:val="20"/>
               </w:rPr>
               <w:t>4.1</w:t>
             </w:r>
@@ -3458,6 +3306,7 @@
             <w:r>
               <w:rPr>
                 <w:rFonts w:ascii="Times New Roman" w:hAnsi="Times New Roman" w:cs="Times New Roman"/>
+                <w:sz w:val="20"/>
               </w:rPr>
               <w:t>Evaluation Metrics</w:t>
             </w:r>
@@ -3479,6 +3328,7 @@
             <w:r>
               <w:rPr>
                 <w:rFonts w:ascii="Times New Roman" w:hAnsi="Times New Roman" w:cs="Times New Roman"/>
+                <w:sz w:val="20"/>
               </w:rPr>
               <w:t>22</w:t>
             </w:r>
@@ -3522,6 +3372,7 @@
             <w:r>
               <w:rPr>
                 <w:rFonts w:ascii="Times New Roman" w:hAnsi="Times New Roman" w:cs="Times New Roman"/>
+                <w:sz w:val="20"/>
               </w:rPr>
               <w:t>4.2</w:t>
             </w:r>
@@ -3544,6 +3395,7 @@
             <w:r>
               <w:rPr>
                 <w:rFonts w:ascii="Times New Roman" w:hAnsi="Times New Roman" w:cs="Times New Roman"/>
+                <w:sz w:val="20"/>
               </w:rPr>
               <w:t>Results and Analysis</w:t>
             </w:r>
@@ -3565,6 +3417,7 @@
             <w:r>
               <w:rPr>
                 <w:rFonts w:ascii="Times New Roman" w:hAnsi="Times New Roman" w:cs="Times New Roman"/>
+                <w:sz w:val="20"/>
               </w:rPr>
               <w:t>23</w:t>
             </w:r>
@@ -3595,6 +3448,7 @@
                 <w:rFonts w:ascii="Times New Roman" w:hAnsi="Times New Roman" w:cs="Times New Roman"/>
                 <w:b/>
                 <w:bCs/>
+                <w:sz w:val="20"/>
               </w:rPr>
               <w:t>5.</w:t>
             </w:r>
@@ -3621,6 +3475,7 @@
                 <w:rFonts w:ascii="Times New Roman" w:hAnsi="Times New Roman" w:cs="Times New Roman"/>
                 <w:b/>
                 <w:bCs/>
+                <w:sz w:val="20"/>
               </w:rPr>
               <w:t>CONCLUSION AND FUTURE WORK</w:t>
             </w:r>
@@ -3642,6 +3497,7 @@
             <w:r>
               <w:rPr>
                 <w:rFonts w:ascii="Times New Roman" w:hAnsi="Times New Roman" w:cs="Times New Roman"/>
+                <w:sz w:val="20"/>
               </w:rPr>
               <w:t>24</w:t>
             </w:r>
@@ -3685,6 +3541,7 @@
             <w:r>
               <w:rPr>
                 <w:rFonts w:ascii="Times New Roman" w:hAnsi="Times New Roman" w:cs="Times New Roman"/>
+                <w:sz w:val="20"/>
               </w:rPr>
               <w:t>5.1</w:t>
             </w:r>
@@ -3707,6 +3564,7 @@
             <w:r>
               <w:rPr>
                 <w:rFonts w:ascii="Times New Roman" w:hAnsi="Times New Roman" w:cs="Times New Roman"/>
+                <w:sz w:val="20"/>
               </w:rPr>
               <w:t>Summary of the contributions</w:t>
             </w:r>
@@ -3728,6 +3586,7 @@
             <w:r>
               <w:rPr>
                 <w:rFonts w:ascii="Times New Roman" w:hAnsi="Times New Roman" w:cs="Times New Roman"/>
+                <w:sz w:val="20"/>
               </w:rPr>
               <w:t>24</w:t>
             </w:r>
@@ -3768,6 +3627,7 @@
             <w:r>
               <w:rPr>
                 <w:rFonts w:ascii="Times New Roman" w:hAnsi="Times New Roman" w:cs="Times New Roman"/>
+                <w:sz w:val="20"/>
               </w:rPr>
               <w:t>5.2</w:t>
             </w:r>
@@ -3790,6 +3650,7 @@
             <w:r>
               <w:rPr>
                 <w:rFonts w:ascii="Times New Roman" w:hAnsi="Times New Roman" w:cs="Times New Roman"/>
+                <w:sz w:val="20"/>
               </w:rPr>
               <w:t xml:space="preserve">Future work </w:t>
             </w:r>
@@ -3811,6 +3672,7 @@
             <w:r>
               <w:rPr>
                 <w:rFonts w:ascii="Times New Roman" w:hAnsi="Times New Roman" w:cs="Times New Roman"/>
+                <w:sz w:val="20"/>
               </w:rPr>
               <w:t>25</w:t>
             </w:r>
@@ -8354,6 +8216,7 @@
     </w:p>
     <w:p>
       <w:pPr>
+        <w:spacing w:before="240" w:after="120"/>
         <w:jc w:val="center"/>
       </w:pPr>
       <w:r>
@@ -8394,7 +8257,7 @@
     <w:p>
       <w:pPr>
         <w:pStyle w:val="NoSpacing"/>
-        <w:spacing w:line="360" w:lineRule="auto"/>
+        <w:spacing w:line="360" w:lineRule="auto" w:after="240"/>
         <w:jc w:val="center"/>
         <w:rPr>
           <w:rFonts w:ascii="Times New Roman" w:hAnsi="Times New Roman" w:cs="Times New Roman"/>
@@ -8750,13 +8613,68 @@
     </w:p>
     <w:p>
       <w:pPr>
+        <w:spacing w:before="240" w:after="80"/>
+        <w:jc w:val="center"/>
+      </w:pPr>
+      <w:r>
+        <w:drawing>
+          <wp:inline xmlns:a="http://schemas.openxmlformats.org/drawingml/2006/main" xmlns:pic="http://schemas.openxmlformats.org/drawingml/2006/picture">
+            <wp:extent cx="5303520" cy="3248933"/>
+            <wp:docPr id="1574936018" name="Picture 1574936018"/>
+            <wp:cNvGraphicFramePr>
+              <a:graphicFrameLocks noChangeAspect="1"/>
+            </wp:cNvGraphicFramePr>
+            <a:graphic>
+              <a:graphicData uri="http://schemas.openxmlformats.org/drawingml/2006/picture">
+                <pic:pic>
+                  <pic:nvPicPr>
+                    <pic:cNvPr id="0" name="wordcloud.png"/>
+                    <pic:cNvPicPr/>
+                  </pic:nvPicPr>
+                  <pic:blipFill>
+                    <a:blip r:embed="rId16"/>
+                    <a:stretch>
+                      <a:fillRect/>
+                    </a:stretch>
+                  </pic:blipFill>
+                  <pic:spPr>
+                    <a:xfrm>
+                      <a:off x="0" y="0"/>
+                      <a:ext cx="5303520" cy="3248933"/>
+                    </a:xfrm>
+                    <a:prstGeom prst="rect"/>
+                  </pic:spPr>
+                </pic:pic>
+              </a:graphicData>
+            </a:graphic>
+          </wp:inline>
+        </w:drawing>
+      </w:r>
+    </w:p>
+    <w:p>
+      <w:pPr>
+        <w:spacing w:after="240"/>
+        <w:jc w:val="center"/>
+      </w:pPr>
+      <w:r>
+        <w:rPr>
+          <w:rFonts w:ascii="Times New Roman" w:hAnsi="Times New Roman"/>
+          <w:i/>
+          <w:sz w:val="20"/>
+        </w:rPr>
+        <w:t>Figure 3.1b: Word Cloud of the HandRehab AI Clinical Diary Corpus displaying the most prominent symptom descriptors and recovery terms.</w:t>
+      </w:r>
+    </w:p>
+    <w:p>
+      <w:pPr>
+        <w:spacing w:before="240" w:after="80"/>
         <w:jc w:val="center"/>
       </w:pPr>
       <w:r>
         <w:drawing>
           <wp:inline xmlns:a="http://schemas.openxmlformats.org/drawingml/2006/main" xmlns:pic="http://schemas.openxmlformats.org/drawingml/2006/picture">
             <wp:extent cx="5303520" cy="3777327"/>
-            <wp:docPr id="1574936018" name="Picture 1574936018"/>
+            <wp:docPr id="1574936019" name="Picture 1574936019"/>
             <wp:cNvGraphicFramePr>
               <a:graphicFrameLocks noChangeAspect="1"/>
             </wp:cNvGraphicFramePr>
@@ -8768,7 +8686,7 @@
                     <pic:cNvPicPr/>
                   </pic:nvPicPr>
                   <pic:blipFill>
-                    <a:blip r:embed="rId16"/>
+                    <a:blip r:embed="rId17"/>
                     <a:stretch>
                       <a:fillRect/>
                     </a:stretch>
@@ -8789,46 +8707,7 @@
     </w:p>
     <w:p>
       <w:pPr>
-        <w:jc w:val="center"/>
-      </w:pPr>
-      <w:r>
-        <w:drawing>
-          <wp:inline xmlns:a="http://schemas.openxmlformats.org/drawingml/2006/main" xmlns:pic="http://schemas.openxmlformats.org/drawingml/2006/picture">
-            <wp:extent cx="5303520" cy="3248933"/>
-            <wp:docPr id="1574936019" name="Picture 1574936019"/>
-            <wp:cNvGraphicFramePr>
-              <a:graphicFrameLocks noChangeAspect="1"/>
-            </wp:cNvGraphicFramePr>
-            <a:graphic>
-              <a:graphicData uri="http://schemas.openxmlformats.org/drawingml/2006/picture">
-                <pic:pic>
-                  <pic:nvPicPr>
-                    <pic:cNvPr id="0" name="wordcloud.png"/>
-                    <pic:cNvPicPr/>
-                  </pic:nvPicPr>
-                  <pic:blipFill>
-                    <a:blip r:embed="rId17"/>
-                    <a:stretch>
-                      <a:fillRect/>
-                    </a:stretch>
-                  </pic:blipFill>
-                  <pic:spPr>
-                    <a:xfrm>
-                      <a:off x="0" y="0"/>
-                      <a:ext cx="5303520" cy="3248933"/>
-                    </a:xfrm>
-                    <a:prstGeom prst="rect"/>
-                  </pic:spPr>
-                </pic:pic>
-              </a:graphicData>
-            </a:graphic>
-          </wp:inline>
-        </w:drawing>
-      </w:r>
-    </w:p>
-    <w:p>
-      <w:pPr>
-        <w:spacing w:after="240"/>
+        <w:spacing w:after="280"/>
         <w:jc w:val="center"/>
       </w:pPr>
       <w:r>
@@ -8837,20 +8716,6 @@
           <w:i/>
           <w:sz w:val="20"/>
         </w:rPr>
-        <w:t>Figure 3.1b: Word Cloud of the HandRehab AI Clinical Diary Corpus displaying the most prominent symptom descriptors and functional terms.</w:t>
-      </w:r>
-    </w:p>
-    <w:p>
-      <w:pPr>
-        <w:spacing w:after="240"/>
-        <w:jc w:val="center"/>
-      </w:pPr>
-      <w:r>
-        <w:rPr>
-          <w:rFonts w:ascii="Times New Roman" w:hAnsi="Times New Roman"/>
-          <w:i/>
-          <w:sz w:val="20"/>
-        </w:rPr>
         <w:t>Figure 3.1c: Bigram Association Network Graph showing common symptom collocations and clinical dependency pairs across the HandRehab AI corpus.</w:t>
       </w:r>
     </w:p>
@@ -9137,6 +9002,7 @@
     </w:p>
     <w:p>
       <w:pPr>
+        <w:spacing w:before="240" w:after="120"/>
         <w:jc w:val="center"/>
       </w:pPr>
       <w:r>
@@ -9177,7 +9043,7 @@
     <w:p>
       <w:pPr>
         <w:pStyle w:val="NoSpacing"/>
-        <w:spacing w:line="360" w:lineRule="auto"/>
+        <w:spacing w:line="360" w:lineRule="auto" w:after="240"/>
         <w:jc w:val="center"/>
         <w:rPr>
           <w:rFonts w:ascii="Times New Roman" w:hAnsi="Times New Roman" w:cs="Times New Roman"/>
@@ -12098,6 +11964,7 @@
     </w:p>
     <w:p>
       <w:pPr>
+        <w:spacing w:before="240" w:after="120"/>
         <w:jc w:val="center"/>
       </w:pPr>
       <w:r>
@@ -12138,7 +12005,7 @@
     <w:p>
       <w:pPr>
         <w:pStyle w:val="NoSpacing"/>
-        <w:spacing w:line="360" w:lineRule="auto"/>
+        <w:spacing w:line="360" w:lineRule="auto" w:after="240"/>
         <w:jc w:val="center"/>
         <w:rPr>
           <w:rFonts w:ascii="Times New Roman" w:hAnsi="Times New Roman" w:cs="Times New Roman"/>
@@ -13844,6 +13711,7 @@
     </w:p>
     <w:p>
       <w:pPr>
+        <w:spacing w:before="240" w:after="120"/>
         <w:jc w:val="center"/>
       </w:pPr>
       <w:r>
@@ -13884,7 +13752,7 @@
     <w:p>
       <w:pPr>
         <w:pStyle w:val="NoSpacing"/>
-        <w:spacing w:line="360" w:lineRule="auto"/>
+        <w:spacing w:line="360" w:lineRule="auto" w:after="240"/>
         <w:jc w:val="center"/>
         <w:rPr>
           <w:rFonts w:ascii="Times New Roman" w:hAnsi="Times New Roman" w:cs="Times New Roman"/>
@@ -13929,6 +13797,7 @@
     </w:p>
     <w:p>
       <w:pPr>
+        <w:spacing w:before="240" w:after="120"/>
         <w:jc w:val="center"/>
       </w:pPr>
       <w:r>
@@ -13969,7 +13838,7 @@
     <w:p>
       <w:pPr>
         <w:pStyle w:val="NoSpacing"/>
-        <w:spacing w:line="360" w:lineRule="auto"/>
+        <w:spacing w:line="360" w:lineRule="auto" w:after="240"/>
         <w:jc w:val="center"/>
         <w:rPr>
           <w:rFonts w:ascii="Times New Roman" w:hAnsi="Times New Roman" w:cs="Times New Roman"/>
@@ -14036,6 +13905,7 @@
     </w:p>
     <w:p>
       <w:pPr>
+        <w:spacing w:before="240" w:after="120"/>
         <w:jc w:val="center"/>
       </w:pPr>
       <w:r>
@@ -14076,7 +13946,7 @@
     <w:p>
       <w:pPr>
         <w:pStyle w:val="NoSpacing"/>
-        <w:spacing w:line="360" w:lineRule="auto"/>
+        <w:spacing w:line="360" w:lineRule="auto" w:after="240"/>
         <w:jc w:val="center"/>
         <w:rPr>
           <w:rFonts w:ascii="Times New Roman" w:hAnsi="Times New Roman" w:cs="Times New Roman"/>
@@ -22384,13 +22254,68 @@
     </w:p>
     <w:p>
       <w:pPr>
+        <w:spacing w:before="240" w:after="80"/>
+        <w:jc w:val="center"/>
+      </w:pPr>
+      <w:r>
+        <w:drawing>
+          <wp:inline xmlns:a="http://schemas.openxmlformats.org/drawingml/2006/main" xmlns:pic="http://schemas.openxmlformats.org/drawingml/2006/picture">
+            <wp:extent cx="5303520" cy="4419600"/>
+            <wp:docPr id="1574936020" name="Picture 1574936020"/>
+            <wp:cNvGraphicFramePr>
+              <a:graphicFrameLocks noChangeAspect="1"/>
+            </wp:cNvGraphicFramePr>
+            <a:graphic>
+              <a:graphicData uri="http://schemas.openxmlformats.org/drawingml/2006/picture">
+                <pic:pic>
+                  <pic:nvPicPr>
+                    <pic:cNvPr id="0" name="figure_4_3_trend_forecast_plot.png"/>
+                    <pic:cNvPicPr/>
+                  </pic:nvPicPr>
+                  <pic:blipFill>
+                    <a:blip r:embed="rId18"/>
+                    <a:stretch>
+                      <a:fillRect/>
+                    </a:stretch>
+                  </pic:blipFill>
+                  <pic:spPr>
+                    <a:xfrm>
+                      <a:off x="0" y="0"/>
+                      <a:ext cx="5303520" cy="4419600"/>
+                    </a:xfrm>
+                    <a:prstGeom prst="rect"/>
+                  </pic:spPr>
+                </pic:pic>
+              </a:graphicData>
+            </a:graphic>
+          </wp:inline>
+        </w:drawing>
+      </w:r>
+    </w:p>
+    <w:p>
+      <w:pPr>
+        <w:spacing w:after="280"/>
+        <w:jc w:val="center"/>
+      </w:pPr>
+      <w:r>
+        <w:rPr>
+          <w:rFonts w:ascii="Times New Roman" w:hAnsi="Times New Roman"/>
+          <w:i/>
+          <w:sz w:val="20"/>
+        </w:rPr>
+        <w:t>Figure 4.3: Simulated 14-day longitudinal recovery trajectory showing next-day continuous feature forecasts and recovery-status classification (Normal Progression vs. Plateau vs. Relapse).</w:t>
+      </w:r>
+    </w:p>
+    <w:p>
+      <w:pPr>
+        <w:spacing w:before="240" w:after="80"/>
         <w:jc w:val="center"/>
       </w:pPr>
       <w:r>
         <w:drawing>
           <wp:inline xmlns:a="http://schemas.openxmlformats.org/drawingml/2006/main" xmlns:pic="http://schemas.openxmlformats.org/drawingml/2006/picture">
             <wp:extent cx="5303520" cy="2357120"/>
-            <wp:docPr id="1574936020" name="Picture 1574936020"/>
+            <wp:docPr id="1574936021" name="Picture 1574936021"/>
             <wp:cNvGraphicFramePr>
               <a:graphicFrameLocks noChangeAspect="1"/>
             </wp:cNvGraphicFramePr>
@@ -22402,7 +22327,7 @@
                     <pic:cNvPicPr/>
                   </pic:nvPicPr>
                   <pic:blipFill>
-                    <a:blip r:embed="rId18"/>
+                    <a:blip r:embed="rId19"/>
                     <a:stretch>
                       <a:fillRect/>
                     </a:stretch>
@@ -22423,60 +22348,7 @@
     </w:p>
     <w:p>
       <w:pPr>
-        <w:jc w:val="center"/>
-      </w:pPr>
-      <w:r>
-        <w:drawing>
-          <wp:inline xmlns:a="http://schemas.openxmlformats.org/drawingml/2006/main" xmlns:pic="http://schemas.openxmlformats.org/drawingml/2006/picture">
-            <wp:extent cx="5303520" cy="4419600"/>
-            <wp:docPr id="1574936021" name="Picture 1574936021"/>
-            <wp:cNvGraphicFramePr>
-              <a:graphicFrameLocks noChangeAspect="1"/>
-            </wp:cNvGraphicFramePr>
-            <a:graphic>
-              <a:graphicData uri="http://schemas.openxmlformats.org/drawingml/2006/picture">
-                <pic:pic>
-                  <pic:nvPicPr>
-                    <pic:cNvPr id="0" name="figure_4_3_trend_forecast_plot.png"/>
-                    <pic:cNvPicPr/>
-                  </pic:nvPicPr>
-                  <pic:blipFill>
-                    <a:blip r:embed="rId19"/>
-                    <a:stretch>
-                      <a:fillRect/>
-                    </a:stretch>
-                  </pic:blipFill>
-                  <pic:spPr>
-                    <a:xfrm>
-                      <a:off x="0" y="0"/>
-                      <a:ext cx="5303520" cy="4419600"/>
-                    </a:xfrm>
-                    <a:prstGeom prst="rect"/>
-                  </pic:spPr>
-                </pic:pic>
-              </a:graphicData>
-            </a:graphic>
-          </wp:inline>
-        </w:drawing>
-      </w:r>
-    </w:p>
-    <w:p>
-      <w:pPr>
-        <w:spacing w:after="240"/>
-        <w:jc w:val="center"/>
-      </w:pPr>
-      <w:r>
-        <w:rPr>
-          <w:rFonts w:ascii="Times New Roman" w:hAnsi="Times New Roman"/>
-          <w:i/>
-          <w:sz w:val="20"/>
-        </w:rPr>
-        <w:t>Figure 4.3: Simulated 14-day longitudinal recovery trajectory showing next-day continuous feature forecasts and status classification (Normal vs. Plateau vs. Relapse).</w:t>
-      </w:r>
-    </w:p>
-    <w:p>
-      <w:pPr>
-        <w:spacing w:after="240"/>
+        <w:spacing w:after="280"/>
         <w:jc w:val="center"/>
       </w:pPr>
       <w:r>

</xml_diff>